<commit_message>
refactor: update timestamps and content in final reports
Co-authored-by: hcharfeddine <156126454+hcharfeddine@users.noreply.github.com>
</commit_message>
<xml_diff>
--- a/community_detection_final_report.docx
+++ b/community_detection_final_report.docx
@@ -521,12 +521,17 @@
         <w:pStyle w:val="Heading1"/>
       </w:pPr>
       <w:r>
-        <w:t>4. Requested figures</w:t>
+        <w:t>4. Calculation methodology</w:t>
       </w:r>
     </w:p>
     <w:p>
       <w:r>
-        <w:t>The community-size distribution should be plotted with logarithmic axes. The cumulative fraction of papers should be plotted against communities ranked by decreasing size, with a logarithmic x-axis. The supplied figures show a highly concentrated distribution: the cumulative curve reaches approximately 99.82% at the first community and remains nearly flat thereafter.</w:t>
+        <w:t>Community sizes were calculated as s_i = |{v : C(v)=i}|, where C(v) is the community assigned to paper v. The mean is the sum of all community sizes divided by the number of communities; the median and percentiles were calculated after sorting community sizes. Singleton communities were counted using sum of the indicator 1(s_i = 1). The largest-community fraction is max(s_i)/N, and the top-10 fraction is the sum of the ten largest sizes divided by N. Node coverage is assigned nodes divided by N. Edge coverage is the number of citation edges whose two endpoints have valid community assignments divided by the total number of edges.</w:t>
+      </w:r>
+    </w:p>
+    <w:p>
+      <w:r>
+        <w:t>Singleton count: communities with exactly one paper. Largest-community fraction: max(s_i)/N. Top-10 fraction: sum of the ten largest community sizes divided by N. Node coverage: assigned nodes/N. Edge coverage: edges with both endpoints assigned divided by total edges.</w:t>
       </w:r>
     </w:p>
     <w:p>
@@ -534,12 +539,12 @@
         <w:pStyle w:val="Heading1"/>
       </w:pPr>
       <w:r>
-        <w:t>5. Modularity</w:t>
+        <w:t>5. Modularity calculation</w:t>
       </w:r>
     </w:p>
     <w:p>
       <w:r>
-        <w:t>The modularity obtained from the constructed community partition is Q = 0.0000213681. This is effectively close to zero and indicates weak community separation under the degree-preserving null model.</w:t>
+        <w:t>Modularity was calculated using Q = sum_c [l_c/M - (d_c/(2M))^2], where l_c is the number of citation edges internal to community c, d_c is the sum of in-degree and out-degree of nodes in c, and M is the total number of citation edges. The resulting modularity was Q = 0.0000213681. A value close to zero indicates weak separation relative to a degree-preserving random-network baseline.</w:t>
       </w:r>
     </w:p>
     <w:p>
@@ -547,12 +552,12 @@
         <w:pStyle w:val="Heading1"/>
       </w:pPr>
       <w:r>
-        <w:t>6. Runtime</w:t>
+        <w:t>6. Requested figures</w:t>
       </w:r>
     </w:p>
     <w:p>
       <w:r>
-        <w:t>The measured runtime available in the results is 70,379.24 seconds, or approximately 19.55 hours. This is the analysis and modularity-calculation runtime. It should not be labelled as the original detection runtime unless the detection log records the same interval.</w:t>
+        <w:t>The community-size distribution is plotted on logarithmic axes. The cumulative fraction of papers is plotted against communities ranked by decreasing size, with a logarithmic x-axis. The supplied figures show a highly concentrated distribution: the cumulative curve reaches approximately 99.82% at the first community and remains nearly flat thereafter.</w:t>
       </w:r>
     </w:p>
     <w:p>
@@ -560,7 +565,20 @@
         <w:pStyle w:val="Heading1"/>
       </w:pPr>
       <w:r>
-        <w:t>7. Interpretation</w:t>
+        <w:t>7. Runtime calculation</w:t>
+      </w:r>
+    </w:p>
+    <w:p>
+      <w:r>
+        <w:t>Runtime was measured as elapsed wall-clock time: start_time = time.time(); analysis; runtime_seconds = time.time() - start_time. The measured runtime was 70,379.24 seconds, approximately 19.55 hours. This is the analysis and modularity-calculation runtime, not confirmed original detection runtime.</w:t>
+      </w:r>
+    </w:p>
+    <w:p>
+      <w:pPr>
+        <w:pStyle w:val="Heading1"/>
+      </w:pPr>
+      <w:r>
+        <w:t>8. Interpretation</w:t>
       </w:r>
     </w:p>
     <w:p>
@@ -573,7 +591,7 @@
         <w:pStyle w:val="Heading1"/>
       </w:pPr>
       <w:r>
-        <w:t>8. Reproducibility note</w:t>
+        <w:t>9. Reproducibility note</w:t>
       </w:r>
     </w:p>
     <w:p>

</xml_diff>